<commit_message>
fix: add space-before to role/project header lines
Per feedback on #33: employer entries were rendering too close together.
_header_line (shared by both experience and project entries) now carries
its own 160-twip space-before, so consecutive role/project blocks get
visual separation from the previous entry's last bullet -- everything
else in a header block stays spaced tight against what precedes it.

Verified against the real Rula v5 fixture: all 23 bullets unchanged,
only the header-line spacing differs. Updated the refactored-layout
fixture docx to match.
</commit_message>
<xml_diff>
--- a/tests/fixtures/rula-senior-software-engineer-patient-onboarding-v5-refactored-layout.docx
+++ b/tests/fixtures/rula-senior-software-engineer-patient-onboarding-v5-refactored-layout.docx
@@ -174,6 +174,7 @@
         <w:tabs>
           <w:tab w:pos="10240" w:val="right"/>
         </w:tabs>
+        <w:spacing w:before="160"/>
       </w:pPr>
       <w:r>
         <w:rPr>
@@ -257,6 +258,7 @@
         <w:tabs>
           <w:tab w:pos="10240" w:val="right"/>
         </w:tabs>
+        <w:spacing w:before="160"/>
       </w:pPr>
       <w:r>
         <w:rPr>
@@ -320,6 +322,7 @@
         <w:tabs>
           <w:tab w:pos="10240" w:val="right"/>
         </w:tabs>
+        <w:spacing w:before="160"/>
       </w:pPr>
       <w:r>
         <w:rPr>
@@ -363,6 +366,7 @@
         <w:tabs>
           <w:tab w:pos="10240" w:val="right"/>
         </w:tabs>
+        <w:spacing w:before="160"/>
       </w:pPr>
       <w:r>
         <w:rPr>
@@ -406,6 +410,7 @@
         <w:tabs>
           <w:tab w:pos="10240" w:val="right"/>
         </w:tabs>
+        <w:spacing w:before="160"/>
       </w:pPr>
       <w:r>
         <w:rPr>
@@ -449,6 +454,7 @@
         <w:tabs>
           <w:tab w:pos="10240" w:val="right"/>
         </w:tabs>
+        <w:spacing w:before="160"/>
       </w:pPr>
       <w:r>
         <w:rPr>
@@ -492,6 +498,7 @@
         <w:tabs>
           <w:tab w:pos="10240" w:val="right"/>
         </w:tabs>
+        <w:spacing w:before="160"/>
       </w:pPr>
       <w:r>
         <w:rPr>
@@ -545,6 +552,7 @@
         <w:tabs>
           <w:tab w:pos="10240" w:val="right"/>
         </w:tabs>
+        <w:spacing w:before="160"/>
       </w:pPr>
       <w:r>
         <w:rPr>

</xml_diff>